<commit_message>
docs: update documentacao_tecnica.docx with minimal slide rebuild
Co-Authored-By: Claude Sonnet 4.6 <noreply@anthropic.com>
</commit_message>
<xml_diff>
--- a/docs/documentacao_tecnica.docx
+++ b/docs/documentacao_tecnica.docx
@@ -6,13 +6,12 @@
       <w:pPr>
         <w:pStyle w:val="Ttulo"/>
         <w:rPr>
-          <w:color w:val="auto"/>
           <w:lang w:val="pt-BR"/>
         </w:rPr>
       </w:pPr>
       <w:r>
         <w:rPr>
-          <w:color w:val="auto"/>
+          <w:color w:val="1A1A2E"/>
           <w:lang w:val="pt-BR"/>
         </w:rPr>
         <w:t>Documentação Técnica — Pipeline Medallion End-to-End</w:t>
@@ -28,27 +27,19 @@
         <w:rPr>
           <w:lang w:val="pt-BR"/>
         </w:rPr>
-        <w:t>Case Técnico · Engenheiro de Dados · Autor: Ronnan — ronnan_ok@hotmail.com</w:t>
+        <w:t>Case Técnico · Engenheiro de Dados · Autor: Ronnan</w:t>
       </w:r>
-    </w:p>
-    <w:p>
-      <w:pPr>
-        <w:rPr>
-          <w:lang w:val="pt-BR"/>
-        </w:rPr>
-      </w:pPr>
     </w:p>
     <w:p>
       <w:pPr>
         <w:pStyle w:val="Ttulo1"/>
         <w:rPr>
-          <w:color w:val="auto"/>
           <w:lang w:val="pt-BR"/>
         </w:rPr>
       </w:pPr>
       <w:r>
         <w:rPr>
-          <w:color w:val="auto"/>
+          <w:color w:val="1A5376"/>
           <w:lang w:val="pt-BR"/>
         </w:rPr>
         <w:t>1. Visão Geral da Solução</w:t>
@@ -69,16 +60,336 @@
     </w:p>
     <w:p>
       <w:pPr>
-        <w:pStyle w:val="Ttulo2"/>
         <w:rPr>
-          <w:color w:val="auto"/>
+          <w:b/>
+          <w:bCs/>
+          <w:lang w:val="pt-BR"/>
         </w:rPr>
       </w:pPr>
       <w:r>
         <w:rPr>
-          <w:color w:val="auto"/>
+          <w:b/>
+          <w:bCs/>
+          <w:lang w:val="pt-BR"/>
         </w:rPr>
-        <w:t>1.1. Camadas da Arquitetura</w:t>
+        <w:t>Declarative Automation Bundles (DAB).</w:t>
+      </w:r>
+    </w:p>
+    <w:p>
+      <w:pPr>
+        <w:rPr>
+          <w:b/>
+          <w:bCs/>
+          <w:lang w:val="pt-BR"/>
+        </w:rPr>
+      </w:pPr>
+      <w:r>
+        <w:rPr>
+          <w:b/>
+          <w:bCs/>
+          <w:lang w:val="pt-BR"/>
+        </w:rPr>
+        <w:drawing>
+          <wp:inline distT="0" distB="0" distL="0" distR="0" wp14:anchorId="1D0388B6" wp14:editId="4FB6CB09">
+            <wp:extent cx="4524375" cy="2705723"/>
+            <wp:effectExtent l="0" t="0" r="0" b="0"/>
+            <wp:docPr id="638676134" name="Imagem 1"/>
+            <wp:cNvGraphicFramePr>
+              <a:graphicFrameLocks xmlns:a="http://schemas.openxmlformats.org/drawingml/2006/main" noChangeAspect="1"/>
+            </wp:cNvGraphicFramePr>
+            <a:graphic xmlns:a="http://schemas.openxmlformats.org/drawingml/2006/main">
+              <a:graphicData uri="http://schemas.openxmlformats.org/drawingml/2006/picture">
+                <pic:pic xmlns:pic="http://schemas.openxmlformats.org/drawingml/2006/picture">
+                  <pic:nvPicPr>
+                    <pic:cNvPr id="638676134" name=""/>
+                    <pic:cNvPicPr/>
+                  </pic:nvPicPr>
+                  <pic:blipFill>
+                    <a:blip r:embed="rId6"/>
+                    <a:stretch>
+                      <a:fillRect/>
+                    </a:stretch>
+                  </pic:blipFill>
+                  <pic:spPr>
+                    <a:xfrm>
+                      <a:off x="0" y="0"/>
+                      <a:ext cx="4530450" cy="2709356"/>
+                    </a:xfrm>
+                    <a:prstGeom prst="rect">
+                      <a:avLst/>
+                    </a:prstGeom>
+                  </pic:spPr>
+                </pic:pic>
+              </a:graphicData>
+            </a:graphic>
+          </wp:inline>
+        </w:drawing>
+      </w:r>
+    </w:p>
+    <w:p>
+      <w:pPr>
+        <w:rPr>
+          <w:b/>
+          <w:bCs/>
+          <w:lang w:val="pt-BR"/>
+        </w:rPr>
+      </w:pPr>
+      <w:r>
+        <w:rPr>
+          <w:b/>
+          <w:bCs/>
+          <w:lang w:val="pt-BR"/>
+        </w:rPr>
+        <w:t>Catalogo e schemas</w:t>
+      </w:r>
+    </w:p>
+    <w:p>
+      <w:pPr>
+        <w:rPr>
+          <w:lang w:val="pt-BR"/>
+        </w:rPr>
+      </w:pPr>
+      <w:r>
+        <w:rPr>
+          <w:lang w:val="pt-BR"/>
+        </w:rPr>
+        <w:drawing>
+          <wp:inline distT="0" distB="0" distL="0" distR="0" wp14:anchorId="1DA28CEC" wp14:editId="1068C5BC">
+            <wp:extent cx="3362325" cy="1575406"/>
+            <wp:effectExtent l="0" t="0" r="0" b="6350"/>
+            <wp:docPr id="1533404370" name="Imagem 1"/>
+            <wp:cNvGraphicFramePr>
+              <a:graphicFrameLocks xmlns:a="http://schemas.openxmlformats.org/drawingml/2006/main" noChangeAspect="1"/>
+            </wp:cNvGraphicFramePr>
+            <a:graphic xmlns:a="http://schemas.openxmlformats.org/drawingml/2006/main">
+              <a:graphicData uri="http://schemas.openxmlformats.org/drawingml/2006/picture">
+                <pic:pic xmlns:pic="http://schemas.openxmlformats.org/drawingml/2006/picture">
+                  <pic:nvPicPr>
+                    <pic:cNvPr id="1533404370" name=""/>
+                    <pic:cNvPicPr/>
+                  </pic:nvPicPr>
+                  <pic:blipFill>
+                    <a:blip r:embed="rId7"/>
+                    <a:stretch>
+                      <a:fillRect/>
+                    </a:stretch>
+                  </pic:blipFill>
+                  <pic:spPr>
+                    <a:xfrm>
+                      <a:off x="0" y="0"/>
+                      <a:ext cx="3366627" cy="1577422"/>
+                    </a:xfrm>
+                    <a:prstGeom prst="rect">
+                      <a:avLst/>
+                    </a:prstGeom>
+                  </pic:spPr>
+                </pic:pic>
+              </a:graphicData>
+            </a:graphic>
+          </wp:inline>
+        </w:drawing>
+      </w:r>
+    </w:p>
+    <w:p>
+      <w:pPr>
+        <w:rPr>
+          <w:lang w:val="pt-BR"/>
+        </w:rPr>
+      </w:pPr>
+    </w:p>
+    <w:p>
+      <w:pPr>
+        <w:rPr>
+          <w:b/>
+          <w:bCs/>
+          <w:lang w:val="pt-BR"/>
+        </w:rPr>
+      </w:pPr>
+      <w:r>
+        <w:rPr>
+          <w:b/>
+          <w:bCs/>
+          <w:lang w:val="pt-BR"/>
+        </w:rPr>
+        <w:lastRenderedPageBreak/>
+        <w:t>Execução do pipeline Full x Incremental</w:t>
+      </w:r>
+    </w:p>
+    <w:p>
+      <w:pPr>
+        <w:rPr>
+          <w:lang w:val="pt-BR"/>
+        </w:rPr>
+      </w:pPr>
+      <w:r>
+        <w:rPr>
+          <w:lang w:val="pt-BR"/>
+        </w:rPr>
+        <w:drawing>
+          <wp:inline distT="0" distB="0" distL="0" distR="0" wp14:anchorId="18B0085B" wp14:editId="36F946B4">
+            <wp:extent cx="5486400" cy="1254760"/>
+            <wp:effectExtent l="0" t="0" r="0" b="2540"/>
+            <wp:docPr id="864504139" name="Imagem 1"/>
+            <wp:cNvGraphicFramePr>
+              <a:graphicFrameLocks xmlns:a="http://schemas.openxmlformats.org/drawingml/2006/main" noChangeAspect="1"/>
+            </wp:cNvGraphicFramePr>
+            <a:graphic xmlns:a="http://schemas.openxmlformats.org/drawingml/2006/main">
+              <a:graphicData uri="http://schemas.openxmlformats.org/drawingml/2006/picture">
+                <pic:pic xmlns:pic="http://schemas.openxmlformats.org/drawingml/2006/picture">
+                  <pic:nvPicPr>
+                    <pic:cNvPr id="864504139" name=""/>
+                    <pic:cNvPicPr/>
+                  </pic:nvPicPr>
+                  <pic:blipFill>
+                    <a:blip r:embed="rId8"/>
+                    <a:stretch>
+                      <a:fillRect/>
+                    </a:stretch>
+                  </pic:blipFill>
+                  <pic:spPr>
+                    <a:xfrm>
+                      <a:off x="0" y="0"/>
+                      <a:ext cx="5486400" cy="1254760"/>
+                    </a:xfrm>
+                    <a:prstGeom prst="rect">
+                      <a:avLst/>
+                    </a:prstGeom>
+                  </pic:spPr>
+                </pic:pic>
+              </a:graphicData>
+            </a:graphic>
+          </wp:inline>
+        </w:drawing>
+      </w:r>
+    </w:p>
+    <w:p>
+      <w:pPr>
+        <w:rPr>
+          <w:b/>
+          <w:bCs/>
+          <w:lang w:val="pt-BR"/>
+        </w:rPr>
+      </w:pPr>
+      <w:r>
+        <w:rPr>
+          <w:b/>
+          <w:bCs/>
+          <w:lang w:val="pt-BR"/>
+        </w:rPr>
+        <w:t>Grafo de execução das tabelas de acordo com a linhagem – Databricks Workflow</w:t>
+      </w:r>
+    </w:p>
+    <w:p>
+      <w:pPr>
+        <w:rPr>
+          <w:lang w:val="pt-BR"/>
+        </w:rPr>
+      </w:pPr>
+      <w:r>
+        <w:rPr>
+          <w:lang w:val="pt-BR"/>
+        </w:rPr>
+        <w:drawing>
+          <wp:inline distT="0" distB="0" distL="0" distR="0" wp14:anchorId="1E8BFC7C" wp14:editId="6D9B6DCB">
+            <wp:extent cx="5486400" cy="5413375"/>
+            <wp:effectExtent l="0" t="0" r="0" b="0"/>
+            <wp:docPr id="7049009" name="Imagem 1"/>
+            <wp:cNvGraphicFramePr>
+              <a:graphicFrameLocks xmlns:a="http://schemas.openxmlformats.org/drawingml/2006/main" noChangeAspect="1"/>
+            </wp:cNvGraphicFramePr>
+            <a:graphic xmlns:a="http://schemas.openxmlformats.org/drawingml/2006/main">
+              <a:graphicData uri="http://schemas.openxmlformats.org/drawingml/2006/picture">
+                <pic:pic xmlns:pic="http://schemas.openxmlformats.org/drawingml/2006/picture">
+                  <pic:nvPicPr>
+                    <pic:cNvPr id="7049009" name=""/>
+                    <pic:cNvPicPr/>
+                  </pic:nvPicPr>
+                  <pic:blipFill>
+                    <a:blip r:embed="rId9"/>
+                    <a:stretch>
+                      <a:fillRect/>
+                    </a:stretch>
+                  </pic:blipFill>
+                  <pic:spPr>
+                    <a:xfrm>
+                      <a:off x="0" y="0"/>
+                      <a:ext cx="5486400" cy="5413375"/>
+                    </a:xfrm>
+                    <a:prstGeom prst="rect">
+                      <a:avLst/>
+                    </a:prstGeom>
+                  </pic:spPr>
+                </pic:pic>
+              </a:graphicData>
+            </a:graphic>
+          </wp:inline>
+        </w:drawing>
+      </w:r>
+    </w:p>
+    <w:p>
+      <w:pPr>
+        <w:rPr>
+          <w:lang w:val="pt-BR"/>
+        </w:rPr>
+      </w:pPr>
+    </w:p>
+    <w:p>
+      <w:pPr>
+        <w:pStyle w:val="Ttulo2"/>
+        <w:numPr>
+          <w:ilvl w:val="1"/>
+          <w:numId w:val="10"/>
+        </w:numPr>
+        <w:rPr>
+          <w:color w:val="E94F37"/>
+        </w:rPr>
+      </w:pPr>
+      <w:r>
+        <w:rPr>
+          <w:color w:val="E94F37"/>
+        </w:rPr>
+        <w:lastRenderedPageBreak/>
+        <w:t>Camadas da Arquitetura</w:t>
+      </w:r>
+    </w:p>
+    <w:p/>
+    <w:p>
+      <w:r>
+        <w:drawing>
+          <wp:inline distT="0" distB="0" distL="0" distR="0" wp14:anchorId="5BC4621B" wp14:editId="5439CD1A">
+            <wp:extent cx="5486400" cy="2795905"/>
+            <wp:effectExtent l="0" t="0" r="0" b="4445"/>
+            <wp:docPr id="1277786610" name="Imagem 1"/>
+            <wp:cNvGraphicFramePr>
+              <a:graphicFrameLocks xmlns:a="http://schemas.openxmlformats.org/drawingml/2006/main" noChangeAspect="1"/>
+            </wp:cNvGraphicFramePr>
+            <a:graphic xmlns:a="http://schemas.openxmlformats.org/drawingml/2006/main">
+              <a:graphicData uri="http://schemas.openxmlformats.org/drawingml/2006/picture">
+                <pic:pic xmlns:pic="http://schemas.openxmlformats.org/drawingml/2006/picture">
+                  <pic:nvPicPr>
+                    <pic:cNvPr id="1277786610" name=""/>
+                    <pic:cNvPicPr/>
+                  </pic:nvPicPr>
+                  <pic:blipFill>
+                    <a:blip r:embed="rId10"/>
+                    <a:stretch>
+                      <a:fillRect/>
+                    </a:stretch>
+                  </pic:blipFill>
+                  <pic:spPr>
+                    <a:xfrm>
+                      <a:off x="0" y="0"/>
+                      <a:ext cx="5486400" cy="2795905"/>
+                    </a:xfrm>
+                    <a:prstGeom prst="rect">
+                      <a:avLst/>
+                    </a:prstGeom>
+                  </pic:spPr>
+                </pic:pic>
+              </a:graphicData>
+            </a:graphic>
+          </wp:inline>
+        </w:drawing>
       </w:r>
     </w:p>
     <w:tbl>
@@ -272,13 +583,12 @@
       <w:pPr>
         <w:pStyle w:val="Ttulo2"/>
         <w:rPr>
-          <w:color w:val="auto"/>
           <w:lang w:val="pt-BR"/>
         </w:rPr>
       </w:pPr>
       <w:r>
         <w:rPr>
-          <w:color w:val="auto"/>
+          <w:color w:val="E94F37"/>
           <w:lang w:val="pt-BR"/>
         </w:rPr>
         <w:t>1.2. DAG de Execução</w:t>
@@ -336,6 +646,7 @@
         <w:rPr>
           <w:lang w:val="pt-BR"/>
         </w:rPr>
+        <w:lastRenderedPageBreak/>
         <w:t>Onda 2 — Bronze (9 tasks): cada bronze inicia assim que o landing do seu formato conclui — sem aguardar outros formatos.</w:t>
       </w:r>
     </w:p>
@@ -350,7 +661,6 @@
         <w:rPr>
           <w:lang w:val="pt-BR"/>
         </w:rPr>
-        <w:lastRenderedPageBreak/>
         <w:t>Onda 3 — Silver (9 tasks paralelas): cada silver aguarda apenas o seu bronze.</w:t>
       </w:r>
     </w:p>
@@ -392,13 +702,10 @@
     <w:p>
       <w:pPr>
         <w:pStyle w:val="Ttulo1"/>
-        <w:rPr>
-          <w:color w:val="auto"/>
-        </w:rPr>
       </w:pPr>
       <w:r>
         <w:rPr>
-          <w:color w:val="auto"/>
+          <w:color w:val="1A5376"/>
         </w:rPr>
         <w:t>2. Regras e Premissas Adotadas</w:t>
       </w:r>
@@ -691,13 +998,12 @@
       <w:pPr>
         <w:pStyle w:val="Ttulo1"/>
         <w:rPr>
-          <w:color w:val="auto"/>
           <w:lang w:val="pt-BR"/>
         </w:rPr>
       </w:pPr>
       <w:r>
         <w:rPr>
-          <w:color w:val="auto"/>
+          <w:color w:val="1A5376"/>
           <w:lang w:val="pt-BR"/>
         </w:rPr>
         <w:t>3. Problemas de Qualidade Encontrados e Tratamentos</w:t>
@@ -766,14 +1072,14 @@
               <w:rPr>
                 <w:lang w:val="pt-BR"/>
               </w:rPr>
-              <w:t xml:space="preserve">Função parse_date_multi_format() implementada em 3-Functions.py usando coalesce(to_date(col, fmt1), to_date(col, fmt2), ...) cobrindo todos os padrões </w:t>
+              <w:t xml:space="preserve">Função parse_date_multi_format() implementada em 3-Functions.py usando </w:t>
             </w:r>
             <w:r>
               <w:rPr>
                 <w:lang w:val="pt-BR"/>
               </w:rPr>
               <w:lastRenderedPageBreak/>
-              <w:t>encontrados nas fontes.</w:t>
+              <w:t>coalesce(to_date(col, fmt1), to_date(col, fmt2), ...) cobrindo todos os padrões encontrados nas fontes.</w:t>
             </w:r>
           </w:p>
         </w:tc>
@@ -1066,13 +1372,12 @@
       <w:pPr>
         <w:pStyle w:val="Ttulo1"/>
         <w:rPr>
-          <w:color w:val="auto"/>
           <w:lang w:val="pt-BR"/>
         </w:rPr>
       </w:pPr>
       <w:r>
         <w:rPr>
-          <w:color w:val="auto"/>
+          <w:color w:val="1A5376"/>
           <w:lang w:val="pt-BR"/>
         </w:rPr>
         <w:t>4. Decisões de Modelagem e Justificativas</w:t>
@@ -1304,7 +1609,14 @@
               <w:rPr>
                 <w:lang w:val="pt-BR"/>
               </w:rPr>
-              <w:t>Todas as dimensões são flat (não normalizadas entre si). Padrão Kimball — evita JOINs encadeados no BI.</w:t>
+              <w:t xml:space="preserve">Todas as dimensões são flat (não </w:t>
+            </w:r>
+            <w:r>
+              <w:rPr>
+                <w:lang w:val="pt-BR"/>
+              </w:rPr>
+              <w:lastRenderedPageBreak/>
+              <w:t>normalizadas entre si). Padrão Kimball — evita JOINs encadeados no BI.</w:t>
             </w:r>
           </w:p>
         </w:tc>
@@ -1351,13 +1663,10 @@
     <w:p>
       <w:pPr>
         <w:pStyle w:val="Ttulo1"/>
-        <w:rPr>
-          <w:color w:val="auto"/>
-        </w:rPr>
       </w:pPr>
       <w:r>
         <w:rPr>
-          <w:color w:val="auto"/>
+          <w:color w:val="1A5376"/>
         </w:rPr>
         <w:t>5. Validações Aplicadas</w:t>
       </w:r>
@@ -1442,13 +1751,10 @@
     <w:p>
       <w:pPr>
         <w:pStyle w:val="Ttulo1"/>
-        <w:rPr>
-          <w:color w:val="auto"/>
-        </w:rPr>
       </w:pPr>
       <w:r>
         <w:rPr>
-          <w:color w:val="auto"/>
+          <w:color w:val="1A5376"/>
         </w:rPr>
         <w:t>6. Limitações da Solução</w:t>
       </w:r>
@@ -1588,72 +1894,6 @@
           </w:tcPr>
           <w:p>
             <w:r>
-              <w:t>XLSX — carga full sempre</w:t>
-            </w:r>
-          </w:p>
-        </w:tc>
-        <w:tc>
-          <w:tcPr>
-            <w:tcW w:w="4320" w:type="dxa"/>
-          </w:tcPr>
-          <w:p>
-            <w:r>
-              <w:rPr>
-                <w:lang w:val="pt-BR"/>
-              </w:rPr>
-              <w:t xml:space="preserve">AutoLoader não suporta XLSX; openpyxl relê o arquivo inteiro a cada execução. </w:t>
-            </w:r>
-            <w:r>
-              <w:t>Não incremental.</w:t>
-            </w:r>
-          </w:p>
-        </w:tc>
-      </w:tr>
-      <w:tr>
-        <w:tc>
-          <w:tcPr>
-            <w:tcW w:w="4320" w:type="dxa"/>
-          </w:tcPr>
-          <w:p>
-            <w:pPr>
-              <w:rPr>
-                <w:lang w:val="pt-BR"/>
-              </w:rPr>
-            </w:pPr>
-            <w:r>
-              <w:rPr>
-                <w:lang w:val="pt-BR"/>
-              </w:rPr>
-              <w:t>Sem testes formais de qualidade</w:t>
-            </w:r>
-          </w:p>
-        </w:tc>
-        <w:tc>
-          <w:tcPr>
-            <w:tcW w:w="4320" w:type="dxa"/>
-          </w:tcPr>
-          <w:p>
-            <w:pPr>
-              <w:rPr>
-                <w:lang w:val="pt-BR"/>
-              </w:rPr>
-            </w:pPr>
-            <w:r>
-              <w:rPr>
-                <w:lang w:val="pt-BR"/>
-              </w:rPr>
-              <w:t>Validações são SQL queries de verificação, não um framework de DQ com alertas e thresholds configuráveis.</w:t>
-            </w:r>
-          </w:p>
-        </w:tc>
-      </w:tr>
-      <w:tr>
-        <w:tc>
-          <w:tcPr>
-            <w:tcW w:w="4320" w:type="dxa"/>
-          </w:tcPr>
-          <w:p>
-            <w:r>
               <w:t>Ambiente Free Edition</w:t>
             </w:r>
           </w:p>
@@ -1688,15 +1928,11 @@
     <w:p>
       <w:pPr>
         <w:pStyle w:val="Ttulo1"/>
-        <w:rPr>
-          <w:color w:val="auto"/>
-        </w:rPr>
       </w:pPr>
       <w:r>
         <w:rPr>
-          <w:color w:val="auto"/>
+          <w:color w:val="1A5376"/>
         </w:rPr>
-        <w:lastRenderedPageBreak/>
         <w:t>7. Sugestões de Evolução</w:t>
       </w:r>
     </w:p>
@@ -1733,6 +1969,7 @@
           <w:b/>
           <w:lang w:val="pt-BR"/>
         </w:rPr>
+        <w:lastRenderedPageBreak/>
         <w:t xml:space="preserve">Camada gold_agg com tabelas pré-agregadas: </w:t>
       </w:r>
       <w:r>
@@ -2008,32 +2245,148 @@
       </w:rPr>
     </w:lvl>
   </w:abstractNum>
-  <w:num w:numId="1" w16cid:durableId="651525427">
+  <w:abstractNum w:abstractNumId="9" w15:restartNumberingAfterBreak="0">
+    <w:nsid w:val="5C61328F"/>
+    <w:multiLevelType w:val="multilevel"/>
+    <w:tmpl w:val="97201E00"/>
+    <w:lvl w:ilvl="0">
+      <w:start w:val="1"/>
+      <w:numFmt w:val="decimal"/>
+      <w:lvlText w:val="%1."/>
+      <w:lvlJc w:val="left"/>
+      <w:pPr>
+        <w:ind w:left="465" w:hanging="465"/>
+      </w:pPr>
+      <w:rPr>
+        <w:rFonts w:hint="default"/>
+      </w:rPr>
+    </w:lvl>
+    <w:lvl w:ilvl="1">
+      <w:start w:val="1"/>
+      <w:numFmt w:val="decimal"/>
+      <w:lvlText w:val="%1.%2."/>
+      <w:lvlJc w:val="left"/>
+      <w:pPr>
+        <w:ind w:left="465" w:hanging="465"/>
+      </w:pPr>
+      <w:rPr>
+        <w:rFonts w:hint="default"/>
+      </w:rPr>
+    </w:lvl>
+    <w:lvl w:ilvl="2">
+      <w:start w:val="1"/>
+      <w:numFmt w:val="decimal"/>
+      <w:lvlText w:val="%1.%2.%3."/>
+      <w:lvlJc w:val="left"/>
+      <w:pPr>
+        <w:ind w:left="720" w:hanging="720"/>
+      </w:pPr>
+      <w:rPr>
+        <w:rFonts w:hint="default"/>
+      </w:rPr>
+    </w:lvl>
+    <w:lvl w:ilvl="3">
+      <w:start w:val="1"/>
+      <w:numFmt w:val="decimal"/>
+      <w:lvlText w:val="%1.%2.%3.%4."/>
+      <w:lvlJc w:val="left"/>
+      <w:pPr>
+        <w:ind w:left="720" w:hanging="720"/>
+      </w:pPr>
+      <w:rPr>
+        <w:rFonts w:hint="default"/>
+      </w:rPr>
+    </w:lvl>
+    <w:lvl w:ilvl="4">
+      <w:start w:val="1"/>
+      <w:numFmt w:val="decimal"/>
+      <w:lvlText w:val="%1.%2.%3.%4.%5."/>
+      <w:lvlJc w:val="left"/>
+      <w:pPr>
+        <w:ind w:left="1080" w:hanging="1080"/>
+      </w:pPr>
+      <w:rPr>
+        <w:rFonts w:hint="default"/>
+      </w:rPr>
+    </w:lvl>
+    <w:lvl w:ilvl="5">
+      <w:start w:val="1"/>
+      <w:numFmt w:val="decimal"/>
+      <w:lvlText w:val="%1.%2.%3.%4.%5.%6."/>
+      <w:lvlJc w:val="left"/>
+      <w:pPr>
+        <w:ind w:left="1080" w:hanging="1080"/>
+      </w:pPr>
+      <w:rPr>
+        <w:rFonts w:hint="default"/>
+      </w:rPr>
+    </w:lvl>
+    <w:lvl w:ilvl="6">
+      <w:start w:val="1"/>
+      <w:numFmt w:val="decimal"/>
+      <w:lvlText w:val="%1.%2.%3.%4.%5.%6.%7."/>
+      <w:lvlJc w:val="left"/>
+      <w:pPr>
+        <w:ind w:left="1440" w:hanging="1440"/>
+      </w:pPr>
+      <w:rPr>
+        <w:rFonts w:hint="default"/>
+      </w:rPr>
+    </w:lvl>
+    <w:lvl w:ilvl="7">
+      <w:start w:val="1"/>
+      <w:numFmt w:val="decimal"/>
+      <w:lvlText w:val="%1.%2.%3.%4.%5.%6.%7.%8."/>
+      <w:lvlJc w:val="left"/>
+      <w:pPr>
+        <w:ind w:left="1440" w:hanging="1440"/>
+      </w:pPr>
+      <w:rPr>
+        <w:rFonts w:hint="default"/>
+      </w:rPr>
+    </w:lvl>
+    <w:lvl w:ilvl="8">
+      <w:start w:val="1"/>
+      <w:numFmt w:val="decimal"/>
+      <w:lvlText w:val="%1.%2.%3.%4.%5.%6.%7.%8.%9."/>
+      <w:lvlJc w:val="left"/>
+      <w:pPr>
+        <w:ind w:left="1800" w:hanging="1800"/>
+      </w:pPr>
+      <w:rPr>
+        <w:rFonts w:hint="default"/>
+      </w:rPr>
+    </w:lvl>
+  </w:abstractNum>
+  <w:num w:numId="1" w16cid:durableId="1614243220">
     <w:abstractNumId w:val="8"/>
   </w:num>
-  <w:num w:numId="2" w16cid:durableId="1972133708">
+  <w:num w:numId="2" w16cid:durableId="1311834271">
     <w:abstractNumId w:val="6"/>
   </w:num>
-  <w:num w:numId="3" w16cid:durableId="54010707">
+  <w:num w:numId="3" w16cid:durableId="23482932">
     <w:abstractNumId w:val="5"/>
   </w:num>
-  <w:num w:numId="4" w16cid:durableId="1121533528">
+  <w:num w:numId="4" w16cid:durableId="295334145">
     <w:abstractNumId w:val="4"/>
   </w:num>
-  <w:num w:numId="5" w16cid:durableId="959460089">
+  <w:num w:numId="5" w16cid:durableId="517617229">
     <w:abstractNumId w:val="7"/>
   </w:num>
-  <w:num w:numId="6" w16cid:durableId="241109964">
+  <w:num w:numId="6" w16cid:durableId="1413241433">
     <w:abstractNumId w:val="3"/>
   </w:num>
-  <w:num w:numId="7" w16cid:durableId="16930539">
+  <w:num w:numId="7" w16cid:durableId="1330868240">
     <w:abstractNumId w:val="2"/>
   </w:num>
-  <w:num w:numId="8" w16cid:durableId="1227181468">
+  <w:num w:numId="8" w16cid:durableId="1815020364">
     <w:abstractNumId w:val="1"/>
   </w:num>
-  <w:num w:numId="9" w16cid:durableId="421994049">
+  <w:num w:numId="9" w16cid:durableId="62148574">
     <w:abstractNumId w:val="0"/>
+  </w:num>
+  <w:num w:numId="10" w16cid:durableId="371465503">
+    <w:abstractNumId w:val="9"/>
   </w:num>
 </w:numbering>
 </file>
@@ -2427,7 +2780,7 @@
   <w:style w:type="paragraph" w:default="1" w:styleId="Normal">
     <w:name w:val="Normal"/>
     <w:qFormat/>
-    <w:rsid w:val="00FC693F"/>
+    <w:rsid w:val="00AA79BB"/>
     <w:rPr>
       <w:rFonts w:ascii="Calibri" w:hAnsi="Calibri"/>
     </w:rPr>

</xml_diff>